<commit_message>
redefined scope, impmentations, refactioring
</commit_message>
<xml_diff>
--- a/docs/SpecCraft_Conversation_Article.docx
+++ b/docs/SpecCraft_Conversation_Article.docx
@@ -1,6 +1,6 @@
 
 <file path=word/document.xml><?xml version="1.0" encoding="utf-8"?>
-<w:document xmlns:wpc="http://schemas.microsoft.com/office/word/2010/wordprocessingCanvas" xmlns:mo="http://schemas.microsoft.com/office/mac/office/2008/main" xmlns:mc="http://schemas.openxmlformats.org/markup-compatibility/2006" xmlns:mv="urn:schemas-microsoft-com:mac:vml" xmlns:o="urn:schemas-microsoft-com:office:office" xmlns:r="http://schemas.openxmlformats.org/officeDocument/2006/relationships" xmlns:m="http://schemas.openxmlformats.org/officeDocument/2006/math" xmlns:v="urn:schemas-microsoft-com:vml" xmlns:wp14="http://schemas.microsoft.com/office/word/2010/wordprocessingDrawing" xmlns:wp="http://schemas.openxmlformats.org/drawingml/2006/wordprocessingDrawing" xmlns:w10="urn:schemas-microsoft-com:office:word" xmlns:w="http://schemas.openxmlformats.org/wordprocessingml/2006/main" xmlns:w14="http://schemas.microsoft.com/office/word/2010/wordml" xmlns:wpg="http://schemas.microsoft.com/office/word/2010/wordprocessingGroup" xmlns:wpi="http://schemas.microsoft.com/office/word/2010/wordprocessingInk" xmlns:wne="http://schemas.microsoft.com/office/word/2006/wordml" xmlns:wps="http://schemas.microsoft.com/office/word/2010/wordprocessingShape" mc:Ignorable="w14 wp14">
+<w:document xmlns:ns1="http://schemas.openxmlformats.org/markup-compatibility/2006" xmlns:w="http://schemas.openxmlformats.org/wordprocessingml/2006/main" ns1:Ignorable="w14 wp14">
   <w:body>
     <w:p>
       <w:pPr>
@@ -30,6 +30,17 @@
       </w:r>
     </w:p>
     <w:p>
+      <w:pPr>
+        <w:pStyle w:val="Normal"/>
+      </w:pPr>
+      <w:r>
+        <w:rPr>
+          <w:b/>
+        </w:rPr>
+        <w:t xml:space="preserve">Status note — 26 September 2026. This article records the product discussion and intended architecture. References to capabilities describe the proposal, not a claim that the repository implements them. Current behavior is recorded in docs/platform-specification.md.</w:t>
+      </w:r>
+    </w:p>
+    <w:p>
       <w:r>
         <w:br w:type="page"/>
       </w:r>
@@ -44,7 +55,7 @@
     </w:p>
     <w:p>
       <w:r>
-        <w:t>The conversation that led to SpecForge started with a simple question: what is Specification-Driven Development, and can natural-language requirements be converted into specifications that AI coding agents can actually use? The discussion quickly moved beyond the idea of a better prompt and toward a more fundamental problem: how can the same software project retain a consistent, authoritative understanding when developers switch between AI agents, models, editors and sessions?</w:t>
+        <w:t>The conversation that led to SpecCraft started with a simple question: what is Specification-Driven Development, and can natural-language requirements be converted into specifications that AI coding agents can actually use? The discussion quickly moved beyond the idea of a better prompt and toward a more fundamental problem: how can the same software project retain a consistent, authoritative understanding when developers switch between AI agents, models, editors and sessions?</w:t>
       </w:r>
     </w:p>
     <w:p>
@@ -143,7 +154,7 @@
     </w:p>
     <w:p>
       <w:r>
-        <w:t>SpecForge emerged as a specification and engineering knowledge layer rather than another coding agent. The agent remains responsible for reasoning and implementation. SpecForge stores and validates the durable project knowledge that agents need.</w:t>
+        <w:t>SpecCraft emerged as a specification and engineering knowledge layer rather than another coding agent. The agent remains responsible for reasoning and implementation. SpecCraft stores and validates the durable project knowledge that agents need.</w:t>
       </w:r>
     </w:p>
     <w:p>
@@ -439,7 +450,7 @@
     </w:p>
     <w:p>
       <w:r>
-        <w:t>Spec Kit is valuable and should be used rather than reimplemented. The proposed architecture treats it as one SDD execution adapter. Canonical SpecForge objects can be projected into Spec Kit's artifacts, and Spec Kit artifacts can be imported with provenance.</w:t>
+        <w:t>Spec Kit is valuable and should be used rather than reimplemented. The proposed architecture treats it as one SDD execution adapter. Canonical SpecCraft objects can be projected into Spec Kit's artifacts, and Spec Kit artifacts can be imported with provenance.</w:t>
       </w:r>
     </w:p>
     <w:p>
@@ -448,7 +459,7 @@
           <w:rFonts w:ascii="Consolas" w:hAnsi="Consolas"/>
           <w:sz w:val="16"/>
         </w:rPr>
-        <w:t>SpecForge canonical model</w:t>
+        <w:t>SpecCraft canonical model</w:t>
         <w:br/>
         <w:t xml:space="preserve">        ↓</w:t>
         <w:br/>

</xml_diff>